<commit_message>
Remove em dashes from the site and the station cards
Rewritten rather than swapped for hyphens: a hyphen where an em dash
was still reads as machine-set punctuation, which defeats the point.
Each sentence now uses a period, comma, colon or parentheses as the
sense requires.

118 replacements across content.js, app.js, index.html, styles.css,
serve.js, 404.html and the README, plus 16 phrases inside the three
station cards. Card text is otherwise untouched.

Bumps the asset version to v=5.
</commit_message>
<xml_diff>
--- a/Instruction Cards/Mixer_Station_Card.docx
+++ b/Instruction Cards/Mixer_Station_Card.docx
@@ -31,7 +31,7 @@
           <w:sz w:val="28"/>
           <w:szCs w:val="28"/>
         </w:rPr>
-        <w:t xml:space="preserve">Sound Rack — Sanctuary AV Closet</w:t>
+        <w:t xml:space="preserve">Sound Rack, Sanctuary AV Closet</w:t>
       </w:r>
     </w:p>
     <w:p>
@@ -127,7 +127,7 @@
                 <w:sz w:val="24"/>
                 <w:szCs w:val="24"/>
               </w:rPr>
-              <w:t xml:space="preserve">This turns on everything: mixer, amplifier, and wireless connection. One button — that's it.</w:t>
+              <w:t xml:space="preserve">This turns on everything: mixer, amplifier, and wireless connection. One button, that's it.</w:t>
             </w:r>
           </w:p>
         </w:tc>
@@ -206,7 +206,7 @@
                 <w:sz w:val="30"/>
                 <w:szCs w:val="30"/>
               </w:rPr>
-              <w:t xml:space="preserve">Wait about 30–60 seconds.</w:t>
+              <w:t xml:space="preserve">Wait about 30 to 60 seconds.</w:t>
             </w:r>
           </w:p>
           <w:p>
@@ -409,7 +409,7 @@
                 <w:sz w:val="24"/>
                 <w:szCs w:val="24"/>
               </w:rPr>
-              <w:t xml:space="preserve">One press powers down the mixer, amplifier, and wireless connection together — same button as startup.</w:t>
+              <w:t xml:space="preserve">One press powers down the mixer, amplifier, and wireless connection together, same button as startup.</w:t>
             </w:r>
           </w:p>
         </w:tc>

</xml_diff>